<commit_message>
Correct GOOSE closeout claims and preserve pending acceptance checks
</commit_message>
<xml_diff>
--- a/GOOSE - Ricky+Damien/GOOSE-SUMMARY.docx
+++ b/GOOSE - Ricky+Damien/GOOSE-SUMMARY.docx
@@ -82,7 +82,7 @@
     </w:p>
     <w:p>
       <w:r>
-        <w:t xml:space="preserve">Six tasks, agreed in </w:t>
+        <w:t xml:space="preserve">The work agreed in </w:t>
       </w:r>
       <w:r>
         <w:rPr>
@@ -291,7 +291,7 @@
     </w:p>
     <w:p>
       <w:r>
-        <w:t xml:space="preserve">That second step matters more than it looks. Acceptance criterion </w:t>
+        <w:t xml:space="preserve">That second step tested the setup instructions on another operating system. Acceptance criterion </w:t>
       </w:r>
       <w:r>
         <w:rPr>
@@ -300,7 +300,16 @@
         <w:t>P-5</w:t>
       </w:r>
       <w:r>
-        <w:t xml:space="preserve"> asks that someone outside the original setup can clone the repository and reproduce a documented result from a clean machine. A cross-platform reproduction is stronger evidence than a second macOS one, because it exercised assumptions the documentation did not know it was making. It also turned up a real bug: the renderer read config files with the platform default encoding, which would have failed on a Windows-authored CSV.</w:t>
+        <w:t xml:space="preserve"> requires reproduction by someone </w:t>
+      </w:r>
+      <w:r>
+        <w:rPr>
+          <w:b/>
+        </w:rPr>
+        <w:t>outside the team</w:t>
+      </w:r>
+      <w:r>
+        <w:t>; Ricky's reproduction is useful supporting evidence but does not satisfy that criterion. It also turned up a portability bug: the renderer read config files with the platform default encoding rather than explicit UTF-8.</w:t>
       </w:r>
     </w:p>
     <w:p>
@@ -317,6 +326,9 @@
     <w:p>
       <w:pPr>
         <w:pStyle w:val="ListNumber"/>
+        <w:numPr>
+          <w:numId w:val="10"/>
+        </w:numPr>
       </w:pPr>
       <w:r>
         <w:t xml:space="preserve">The devkit viewer expects a </w:t>
@@ -335,14 +347,12 @@
     <w:p>
       <w:pPr>
         <w:pStyle w:val="ListNumber"/>
+        <w:numPr>
+          <w:numId w:val="11"/>
+        </w:numPr>
       </w:pPr>
       <w:r>
-        <w:t>The bundled colour map is an 8-class remap in BGR; the downloaded labels are the full</w:t>
-      </w:r>
-    </w:p>
-    <w:p>
-      <w:r>
-        <w:t xml:space="preserve">64-class set in hex. Mixing them </w:t>
+        <w:t xml:space="preserve">The bundled colour map is an 8-class remap in BGR; the downloaded labels are the full 64-class set in hex. Mixing them </w:t>
       </w:r>
       <w:r>
         <w:rPr>
@@ -357,6 +367,9 @@
     <w:p>
       <w:pPr>
         <w:pStyle w:val="ListNumber"/>
+        <w:numPr>
+          <w:numId w:val="12"/>
+        </w:numPr>
       </w:pPr>
       <w:r>
         <w:t>Scans and labels do not share a filename stem (</w:t>
@@ -591,7 +604,7 @@
         <w:t>22 of 64 classes fall below 0.01% of points</w:t>
       </w:r>
       <w:r>
-        <w:t>, six of them with zero points at all. That drove how we define mIoU: averaging over classes that are absent measures taxonomy sparsity rather than model failure.</w:t>
+        <w:t>, six of them with zero points at all. That drove our mIoU rule: exclude classes absent from both ground truth and predictions (zero union), but retain a class that the model incorrectly predicts.</w:t>
       </w:r>
     </w:p>
     <w:p>
@@ -623,16 +636,7 @@
     </w:p>
     <w:p>
       <w:r>
-        <w:t xml:space="preserve">Damien then rendered it across all eight scenarios. The drivable points form a </w:t>
-      </w:r>
-      <w:r>
-        <w:rPr>
-          <w:b/>
-        </w:rPr>
-        <w:t>connected, coherent route in all eight</w:t>
-      </w:r>
-      <w:r>
-        <w:t>, including dense woodland where that route is a narrow ribbon.</w:t>
+        <w:t>Damien rendered it across all eight scenarios. These views illustrate the team's interpretation of human labels, including apparent corridors in woodland. They do not establish a connected, vehicle-safe route or demonstrate a model predicting one.</w:t>
       </w:r>
     </w:p>
     <w:p>
@@ -721,13 +725,7 @@
           <w:p>
             <w:r/>
             <w:r>
-              <w:rPr>
-                <w:b/>
-              </w:rPr>
-              <w:t>Impossible.</w:t>
-            </w:r>
-            <w:r>
-              <w:t xml:space="preserve"> CUDA-only; no configuration makes it work</w:t>
+              <w:t>The tested Pointcept/PTv3 path requires CUDA and cannot run on the machine's Apple GPU</w:t>
             </w:r>
           </w:p>
         </w:tc>
@@ -751,13 +749,7 @@
           <w:p>
             <w:r/>
             <w:r>
-              <w:rPr>
-                <w:b/>
-              </w:rPr>
-              <w:t>Runs</w:t>
-            </w:r>
-            <w:r>
-              <w:t>, in FP32. Automatic mixed precision failed on a kernel-selection assertion</w:t>
+              <w:t>Bounded inference completed in FP32; automatic mixed precision failed on a kernel-selection assertion</w:t>
             </w:r>
           </w:p>
         </w:tc>
@@ -824,7 +816,7 @@
           <w:p>
             <w:r/>
             <w:r>
-              <w:t>Throughput</w:t>
+              <w:t>Partial timing</w:t>
             </w:r>
           </w:p>
         </w:tc>
@@ -835,16 +827,7 @@
           <w:p>
             <w:r/>
             <w:r>
-              <w:t xml:space="preserve">~18.9 s/frame — a complete pass is </w:t>
-            </w:r>
-            <w:r>
-              <w:rPr>
-                <w:b/>
-              </w:rPr>
-              <w:t>≈5.1 hours</w:t>
-            </w:r>
-            <w:r>
-              <w:t xml:space="preserve"> of sustained GPU</w:t>
+              <w:t>18.94 s/frame mean loop-body time over 10 frames, excluding dataloader yield time</w:t>
             </w:r>
           </w:p>
         </w:tc>
@@ -853,16 +836,12 @@
     <w:p/>
     <w:p>
       <w:r>
-        <w:t xml:space="preserve">So </w:t>
+        <w:t>The successful gates establish bounded feasibility on 6 GiB, not full-split memory or runtime feasibility. Multiplying the partial timing by 961 gives about 5.1 hours of loop-body time; this is an extrapolation, not a measured end-to-end duration. Ricky requested that sustained GPU load stop. The recorded stop reason was not an OOM error.</w:t>
       </w:r>
+    </w:p>
+    <w:p>
       <w:r>
-        <w:rPr>
-          <w:b/>
-        </w:rPr>
-        <w:t>6 GiB is enough, and time is the constraint rather than memory.</w:t>
-      </w:r>
-      <w:r>
-        <w:t xml:space="preserve"> We stopped because holding a student laptop at 99% utilisation for five hours is not a reasonable thing to do, and because a full run would not have added radar evidence anyway.</w:t>
+        <w:t>The run used the published checkpoint with a documented compatibility patch, FP32, FlashAttention disabled, patch sizes 64 and one test augmentation. Those settings differ from the published configuration, so a completed run would be a modified-protocol result rather than a direct reproduction of the published 0.8096 mIoU.</w:t>
       </w:r>
     </w:p>
     <w:p>
@@ -942,12 +921,7 @@
         <w:t>`docs/metrics-definitions.md`</w:t>
       </w:r>
       <w:r>
-        <w:t xml:space="preserve"> — every metric defined before it can be reported.</w:t>
-      </w:r>
-    </w:p>
-    <w:p>
-      <w:r>
-        <w:t>The validator rejects a record using an undefined metric name.</w:t>
+        <w:t xml:space="preserve"> — every metric defined before it can be reported. The validator rejects a record using an undefined metric name.</w:t>
       </w:r>
     </w:p>
     <w:p>
@@ -961,12 +935,7 @@
         <w:t>`scripts/session_check.py`</w:t>
       </w:r>
       <w:r>
-        <w:t xml:space="preserve"> — file-ownership and branch guard, so two people with</w:t>
-      </w:r>
-    </w:p>
-    <w:p>
-      <w:r>
-        <w:t>AI assistants working one repository do not collide.</w:t>
+        <w:t xml:space="preserve"> — file-ownership and branch guard, so two people with AI assistants working one repository do not collide.</w:t>
       </w:r>
     </w:p>
     <w:p>
@@ -980,12 +949,7 @@
         <w:t>`docs/dataset-survey-template.md`</w:t>
       </w:r>
       <w:r>
-        <w:t xml:space="preserve"> — the fixed checklist all three datasets are</w:t>
-      </w:r>
-    </w:p>
-    <w:p>
-      <w:r>
-        <w:t>surveyed against.</w:t>
+        <w:t xml:space="preserve"> — the fixed checklist all three datasets are surveyed against.</w:t>
       </w:r>
     </w:p>
     <w:p>
@@ -1001,12 +965,12 @@
         <w:pStyle w:val="Heading3"/>
       </w:pPr>
       <w:r>
-        <w:t>GOOSE answers the terrain question</w:t>
+        <w:t>GOOSE supports the terrain question</w:t>
       </w:r>
     </w:p>
     <w:p>
       <w:r>
-        <w:t>It can distinguish drivable ground from obstacles, off-road, and we can show it in a single figure a non-specialist can read. That is the client's stated interest and it is done.</w:t>
+        <w:t>The human material labels support a reviewable traversability interpretation. The figure demonstrates that mapping, not automatic terrain recognition or vehicle safety. Readability without narration has not been checked by someone outside the pair.</w:t>
       </w:r>
     </w:p>
     <w:p>
@@ -1079,12 +1043,7 @@
         <w:t>reduced sensor set</w:t>
       </w:r>
       <w:r>
-        <w:t>, confirmed by the dataset</w:t>
-      </w:r>
-    </w:p>
-    <w:p>
-      <w:r>
-        <w:t>authors on GitHub;</w:t>
+        <w:t>, confirmed by the dataset authors on GitHub;</w:t>
       </w:r>
     </w:p>
     <w:p>
@@ -1101,12 +1060,7 @@
         <w:t>4D imaging</w:t>
       </w:r>
       <w:r>
-        <w:t>, and their ranges suggest conventional</w:t>
-      </w:r>
-    </w:p>
-    <w:p>
-      <w:r>
-        <w:t>automotive radar.</w:t>
+        <w:t>, and their ranges suggest conventional automotive radar.</w:t>
       </w:r>
     </w:p>
     <w:p>
@@ -1124,7 +1078,7 @@
     </w:p>
     <w:p>
       <w:r>
-        <w:t>3.8% of labelled points beyond 100 m, 1.1% beyond 150 m. There is almost no data in the band decision D-04 asks about. This is a firmer answer than the task mismatch alone.</w:t>
+        <w:t>Only 3.8% of labelled points are beyond 100 m and 1.1% beyond 150 m. This distribution, the segmentation task and the unavailable labelled radar comparison make GOOSE a poor fit for D-04's long-range detection question. Point share alone does not establish the absence of usable long-range examples or a model's performance there.</w:t>
       </w:r>
     </w:p>
     <w:p>
@@ -1316,7 +1270,7 @@
           <w:p>
             <w:r/>
             <w:r>
-              <w:t>✅ Off-road terrain: drivable versus not</w:t>
+              <w:t>✅ Off-road terrain interpretation</w:t>
             </w:r>
           </w:p>
         </w:tc>
@@ -1327,7 +1281,7 @@
           <w:p>
             <w:r/>
             <w:r>
-              <w:t>Answered, with a client-ready figure</w:t>
+              <w:t>Human-label mapping and figure produced; readability check and vehicle-specific judgement remain</w:t>
             </w:r>
           </w:p>
         </w:tc>
@@ -1340,7 +1294,7 @@
           <w:p>
             <w:r/>
             <w:r>
-              <w:t>✅ Cheapest route to an Autoware demo</w:t>
+              <w:t>Possible Autoware demo input</w:t>
             </w:r>
           </w:p>
         </w:tc>
@@ -1351,7 +1305,7 @@
           <w:p>
             <w:r/>
             <w:r>
-              <w:t>The only dataset shipping ROS bags natively — though ROS 1, so conversion is still needed</w:t>
+              <w:t>Native ROS 1 bags exist; topic coverage, conversion and integration still need checking</w:t>
             </w:r>
           </w:p>
         </w:tc>
@@ -1388,7 +1342,7 @@
           <w:p>
             <w:r/>
             <w:r>
-              <w:t>❌ Anything about radar</w:t>
+              <w:t>❌ Paired radar-versus-LiDAR benchmark</w:t>
             </w:r>
           </w:p>
         </w:tc>
@@ -1399,7 +1353,7 @@
           <w:p>
             <w:r/>
             <w:r>
-              <w:t>Six radars, none obtainable</w:t>
+              <w:t>No obtainable labelled radar baseline for this task</w:t>
             </w:r>
           </w:p>
         </w:tc>
@@ -1412,7 +1366,7 @@
           <w:p>
             <w:r/>
             <w:r>
-              <w:t>❌ The long-range question</w:t>
+              <w:t>❌ D-04 long-range detection comparison</w:t>
             </w:r>
           </w:p>
         </w:tc>
@@ -1423,7 +1377,7 @@
           <w:p>
             <w:r/>
             <w:r>
-              <w:t>3.8% of points beyond 100 m</w:t>
+              <w:t>Segmentation task, no paired labelled radar, and sparse long-range coverage</w:t>
             </w:r>
           </w:p>
         </w:tc>
@@ -1816,7 +1770,22 @@
         <w:rPr>
           <w:b/>
         </w:rPr>
-        <w:t>Six result records. Four experiment logs. Sixteen merged pull requests.</w:t>
+        <w:t>Six GOOSE result records and four GOOSE experiment logs.</w:t>
+      </w:r>
+    </w:p>
+    <w:p>
+      <w:r>
+        <w:t xml:space="preserve">The companion Word file is generated from this Markdown with </w:t>
+      </w:r>
+      <w:r>
+        <w:rPr>
+          <w:rFonts w:ascii="Consolas" w:hAnsi="Consolas"/>
+          <w:color w:val="B03060"/>
+        </w:rPr>
+        <w:t>scripts/build_handbook.py</w:t>
+      </w:r>
+      <w:r>
+        <w:t xml:space="preserve"> from the handbook PR (#22). Text and package integrity were checked after regeneration; page-layout inspection remains pending because the review environment has no LibreOffice renderer. Use the Markdown for content review until the Word layout has been checked.</w:t>
       </w:r>
     </w:p>
     <w:p>
@@ -1846,12 +1815,7 @@
         <w:t>A complete PTv3 run</w:t>
       </w:r>
       <w:r>
-        <w:t>, if it is judged worth five hours of compute. The protocol,</w:t>
-      </w:r>
-    </w:p>
-    <w:p>
-      <w:r>
-        <w:t>runtime patch and exact commands are recorded, so it is a matter of scheduling rather than rediscovery.</w:t>
+        <w:t>, only if the client still needs it and suitable compute is approved. Fix the protocol and measure end-to-end requirements first; the 5.1-hour extrapolation does not establish full-run time or memory needs. Do not restart the full local GPU run without Ricky's explicit approval.</w:t>
       </w:r>
     </w:p>
     <w:p>
@@ -1865,12 +1829,7 @@
         <w:t>Settle the mIoU definition first.</w:t>
       </w:r>
       <w:r>
-        <w:t xml:space="preserve"> The reference implementation averages over</w:t>
-      </w:r>
-    </w:p>
-    <w:p>
-      <w:r>
-        <w:t>classes with zero union; ours excludes them. Identical predictions give two different numbers, so this must be decided before any score is reported.</w:t>
+        <w:t xml:space="preserve"> The reference implementation averages over classes with zero union; ours excludes them. The numbers can differ when such classes occur. State the taxonomy and evaluated class set, as well as the runtime changes, before comparing any score with a published result.</w:t>
       </w:r>
     </w:p>
     <w:p>
@@ -1884,7 +1843,7 @@
         <w:t>The 2D image split</w:t>
       </w:r>
       <w:r>
-        <w:t xml:space="preserve"> is untouched. There is a live ICRA 2026 challenge on it.</w:t>
+        <w:t xml:space="preserve"> has not been evaluated by this pair.</w:t>
       </w:r>
     </w:p>
     <w:p>
@@ -1922,12 +1881,15 @@
         <w:pStyle w:val="ListBullet"/>
       </w:pPr>
       <w:r>
-        <w:t>The outside-pair cold read of the figure and survey — required by our own acceptance</w:t>
+        <w:t>P-5's reproduction by someone outside the team is not evidenced by our pair's work.</w:t>
       </w:r>
     </w:p>
     <w:p>
+      <w:pPr>
+        <w:pStyle w:val="ListBullet"/>
+      </w:pPr>
       <w:r>
-        <w:t xml:space="preserve">tests </w:t>
+        <w:t xml:space="preserve">The outside-pair cold read of the figure and survey — required by our own acceptance tests </w:t>
       </w:r>
       <w:r>
         <w:rPr>
@@ -1945,7 +1907,7 @@
         <w:t>was not performed</w:t>
       </w:r>
       <w:r>
-        <w:t>. It was dropped for time. Anything claiming those artefacts are readable without narration is untested.</w:t>
+        <w:t>. The closeout proposal records that it was dropped for time; this is an unmet check, not a pass. The team should record acceptance of that omission or complete the check before treating closeout as agreed.</w:t>
       </w:r>
     </w:p>
     <w:p>
@@ -2209,6 +2171,24 @@
   </w:num>
   <w:num w:numId="9">
     <w:abstractNumId w:val="0"/>
+  </w:num>
+  <w:num w:numId="10">
+    <w:abstractNumId w:val="7"/>
+    <w:lvlOverride w:ilvl="0">
+      <w:startOverride w:val="1"/>
+    </w:lvlOverride>
+  </w:num>
+  <w:num w:numId="11">
+    <w:abstractNumId w:val="7"/>
+    <w:lvlOverride w:ilvl="0">
+      <w:startOverride w:val="2"/>
+    </w:lvlOverride>
+  </w:num>
+  <w:num w:numId="12">
+    <w:abstractNumId w:val="7"/>
+    <w:lvlOverride w:ilvl="0">
+      <w:startOverride w:val="3"/>
+    </w:lvlOverride>
   </w:num>
 </w:numbering>
 </file>

</xml_diff>